<commit_message>
Update Entrega_proyecto_ia.docx with requested exact screenshot titles and descriptions
</commit_message>
<xml_diff>
--- a/Entrega_proyecto_ia.docx
+++ b/Entrega_proyecto_ia.docx
@@ -192,14 +192,6 @@
     </w:p>
     <w:p>
       <w:r>
-        <w:rPr>
-          <w:sz w:val="22"/>
-        </w:rPr>
-        <w:t>Repositorio público del proyecto:</w:t>
-      </w:r>
-    </w:p>
-    <w:p>
-      <w:r>
         <w:t xml:space="preserve">• Nombre del Repositorio: </w:t>
       </w:r>
       <w:r>
@@ -239,15 +231,20 @@
         <w:pStyle w:val="Heading2"/>
       </w:pPr>
       <w:r>
-        <w:t>Ítem 1: Configuración y Sincronización del Repositorio en GitHub</w:t>
+        <w:rPr>
+          <w:color w:val="141414"/>
+          <w:sz w:val="26"/>
+        </w:rPr>
+        <w:t>1. 01_github_setup.png:</w:t>
       </w:r>
     </w:p>
     <w:p>
       <w:r>
         <w:rPr>
-          <w:sz w:val="20"/>
+          <w:i/>
+          <w:sz w:val="21"/>
         </w:rPr>
-        <w:t>Evidencia de la creación del repositorio público "IA_Proyecto" en GitHub (usuario: rcktsm25), con la rama "main" activa y la estructura completa de archivos versionados (.gitignore, README.md, products.csv, recommendation_system.py y carpeta screenshots).</w:t>
+        <w:t>Captura de pantalla de la página de GitHub mostrando tu repositorio 'IA_Proyecto'.</w:t>
       </w:r>
     </w:p>
     <w:p>
@@ -286,33 +283,26 @@
         </w:drawing>
       </w:r>
     </w:p>
-    <w:p>
-      <w:pPr>
-        <w:jc w:val="center"/>
-      </w:pPr>
-      <w:r>
-        <w:rPr>
-          <w:i/>
-          <w:sz w:val="18"/>
-        </w:rPr>
-        <w:t>Figura 1: Vista general del repositorio público en GitHub.</w:t>
-      </w:r>
-    </w:p>
     <w:p/>
     <w:p>
       <w:pPr>
         <w:pStyle w:val="Heading2"/>
       </w:pPr>
       <w:r>
-        <w:t>Ítem 2: Asistencia de Código en Vivo con GitHub Copilot</w:t>
+        <w:rPr>
+          <w:color w:val="141414"/>
+          <w:sz w:val="26"/>
+        </w:rPr>
+        <w:t>2. 02_copilot_suggestion.png:</w:t>
       </w:r>
     </w:p>
     <w:p>
       <w:r>
         <w:rPr>
-          <w:sz w:val="20"/>
+          <w:i/>
+          <w:sz w:val="21"/>
         </w:rPr>
-        <w:t>Evidencia dentro del editor Visual Studio Code mostrando la extensión oficial de GitHub Copilot en funcionamiento. Se aprecia la sugerencia predictiva en tiempo real (autocompletado en texto gris) al desarrollar la lógica de evaluación y control de flujo en "recommendation_system.py".</w:t>
+        <w:t>Captura de pantalla en Visual Studio Code mostrando cómo GitHub Copilot te sugiere código (autocompletado gris o el panel/chat de Copilot).</w:t>
       </w:r>
     </w:p>
     <w:p>
@@ -351,33 +341,26 @@
         </w:drawing>
       </w:r>
     </w:p>
-    <w:p>
-      <w:pPr>
-        <w:jc w:val="center"/>
-      </w:pPr>
-      <w:r>
-        <w:rPr>
-          <w:i/>
-          <w:sz w:val="18"/>
-        </w:rPr>
-        <w:t>Figura 2: GitHub Copilot sugiriendo código en Visual Studio Code.</w:t>
-      </w:r>
-    </w:p>
     <w:p/>
     <w:p>
       <w:pPr>
         <w:pStyle w:val="Heading2"/>
       </w:pPr>
       <w:r>
-        <w:t>Ítem 3: Ejecución Exitosa, Métricas e Inferencia en Terminal</w:t>
+        <w:rPr>
+          <w:color w:val="141414"/>
+          <w:sz w:val="26"/>
+        </w:rPr>
+        <w:t>3. 03_execution_result.png:</w:t>
       </w:r>
     </w:p>
     <w:p>
       <w:r>
         <w:rPr>
-          <w:sz w:val="20"/>
+          <w:i/>
+          <w:sz w:val="21"/>
         </w:rPr>
-        <w:t>Evidencia de la ejecución del script en la terminal integrada de VS Code sobre el entorno virtual (.venv). El modelo KNeighborsClassifier alcanza un 100.0% de precisión (Accuracy), mostrando la tabla estilizada con las recomendaciones generadas para cada categoría de producto.</w:t>
+        <w:t>Captura de pantalla de la terminal en VS Code ejecutando 'python recommendation_system.py'.</w:t>
       </w:r>
     </w:p>
     <w:p>
@@ -416,83 +399,7 @@
         </w:drawing>
       </w:r>
     </w:p>
-    <w:p>
-      <w:pPr>
-        <w:jc w:val="center"/>
-      </w:pPr>
-      <w:r>
-        <w:rPr>
-          <w:i/>
-          <w:sz w:val="18"/>
-        </w:rPr>
-        <w:t>Figura 3: Ejecución del sistema de recomendación y resultados en consola.</w:t>
-      </w:r>
-    </w:p>
     <w:p/>
-    <w:p>
-      <w:pPr>
-        <w:pStyle w:val="Heading2"/>
-      </w:pPr>
-      <w:r>
-        <w:t>Ítem 4: Dashboard Analítico de Clústeres y Matriz de Confusión</w:t>
-      </w:r>
-    </w:p>
-    <w:p>
-      <w:r>
-        <w:rPr>
-          <w:sz w:val="20"/>
-        </w:rPr>
-        <w:t>Visualización gráfica de alta resolución generada mediante Matplotlib y Seaborn. Muestra el espacio de características (precio normalizado vs popularidad) con los clústeres de categorías, los puntos de inferencia evaluados y la matriz de confusión.</w:t>
-      </w:r>
-    </w:p>
-    <w:p>
-      <w:r>
-        <w:drawing>
-          <wp:inline xmlns:a="http://schemas.openxmlformats.org/drawingml/2006/main" xmlns:pic="http://schemas.openxmlformats.org/drawingml/2006/picture">
-            <wp:extent cx="5669280" cy="2256297"/>
-            <wp:docPr id="4" name="Picture 4"/>
-            <wp:cNvGraphicFramePr>
-              <a:graphicFrameLocks noChangeAspect="1"/>
-            </wp:cNvGraphicFramePr>
-            <a:graphic>
-              <a:graphicData uri="http://schemas.openxmlformats.org/drawingml/2006/picture">
-                <pic:pic>
-                  <pic:nvPicPr>
-                    <pic:cNvPr id="0" name="03_model_clusters.png"/>
-                    <pic:cNvPicPr/>
-                  </pic:nvPicPr>
-                  <pic:blipFill>
-                    <a:blip r:embed="rId12"/>
-                    <a:stretch>
-                      <a:fillRect/>
-                    </a:stretch>
-                  </pic:blipFill>
-                  <pic:spPr>
-                    <a:xfrm>
-                      <a:off x="0" y="0"/>
-                      <a:ext cx="5669280" cy="2256297"/>
-                    </a:xfrm>
-                    <a:prstGeom prst="rect"/>
-                  </pic:spPr>
-                </pic:pic>
-              </a:graphicData>
-            </a:graphic>
-          </wp:inline>
-        </w:drawing>
-      </w:r>
-    </w:p>
-    <w:p>
-      <w:pPr>
-        <w:jc w:val="center"/>
-      </w:pPr>
-      <w:r>
-        <w:rPr>
-          <w:i/>
-          <w:sz w:val="18"/>
-        </w:rPr>
-        <w:t>Figura 4: Dashboard de Machine Learning y matriz de confusión.</w:t>
-      </w:r>
-    </w:p>
     <w:sectPr>
       <w:pgSz w:w="12240" w:h="15840"/>
       <w:pgMar w:top="1152" w:right="1152" w:bottom="1152" w:left="1152" w:header="720" w:footer="720" w:gutter="0"/>

</xml_diff>

<commit_message>
Enhance Entrega_proyecto_ia.docx with professional academic editorial layout
</commit_message>
<xml_diff>
--- a/Entrega_proyecto_ia.docx
+++ b/Entrega_proyecto_ia.docx
@@ -4,50 +4,63 @@
   <w:body>
     <w:p>
       <w:pPr>
-        <w:pStyle w:val="Title"/>
+        <w:spacing w:after="40"/>
         <w:jc w:val="center"/>
       </w:pPr>
       <w:r>
         <w:rPr>
-          <w:color w:val="BE0000"/>
-          <w:sz w:val="44"/>
+          <w:rFonts w:ascii="Calibri" w:hAnsi="Calibri"/>
+          <w:b/>
+          <w:color w:val="B91C1C"/>
+          <w:sz w:val="22"/>
         </w:rPr>
-        <w:t>INACAP - Ambiente de Aprendizaje (AAI)</w:t>
+        <w:t>INACAP  •  ÁREA DE TECNOLOGÍAS DE LA INFORMACIÓN Y CIBERSEGURIDAD</w:t>
       </w:r>
     </w:p>
     <w:p>
       <w:pPr>
+        <w:spacing w:after="280"/>
         <w:jc w:val="center"/>
       </w:pPr>
       <w:r>
         <w:rPr>
-          <w:b/>
-          <w:color w:val="464646"/>
-          <w:sz w:val="26"/>
+          <w:rFonts w:ascii="Calibri" w:hAnsi="Calibri"/>
+          <w:color w:val="475569"/>
+          <w:sz w:val="19"/>
         </w:rPr>
-        <w:t>Actividad Formativa: GitHub Copilot (ETVI02 - Unidad 3 - Semana 8)</w:t>
+        <w:t>CARRERA DE INFORMÁTICA  •  ASIGNATURA: TENDENCIAS EMERGENTES EN IA (ETVI02)</w:t>
       </w:r>
     </w:p>
     <w:p>
       <w:pPr>
+        <w:spacing w:after="80"/>
         <w:jc w:val="center"/>
       </w:pPr>
       <w:r>
         <w:rPr>
-          <w:color w:val="B4B4B4"/>
+          <w:rFonts w:ascii="Calibri" w:hAnsi="Calibri"/>
+          <w:b/>
+          <w:color w:val="0F172A"/>
+          <w:sz w:val="40"/>
         </w:rPr>
-        <w:t>—————————————————————————————————————————————</w:t>
+        <w:t>INFORME DE ACTIVIDAD FORMATIVA</w:t>
+        <w:br/>
+        <w:t>DESARROLLO ASISTIDO CON GITHUB COPILOT</w:t>
       </w:r>
     </w:p>
     <w:p>
       <w:pPr>
-        <w:pStyle w:val="Heading1"/>
+        <w:spacing w:after="360"/>
+        <w:jc w:val="center"/>
       </w:pPr>
       <w:r>
         <w:rPr>
-          <w:color w:val="1E1E1E"/>
+          <w:rFonts w:ascii="Calibri" w:hAnsi="Calibri"/>
+          <w:i/>
+          <w:color w:val="475569"/>
+          <w:sz w:val="23"/>
         </w:rPr>
-        <w:t>1. Datos de Identificación</w:t>
+        <w:t>Unidad 3: Inteligencia Artificial en el Desarrollo de Software  •  Semana 8</w:t>
       </w:r>
     </w:p>
     <w:tbl>
@@ -58,32 +71,43 @@
         <w:tblLook w:firstColumn="1" w:firstRow="1" w:lastColumn="0" w:lastRow="0" w:noHBand="0" w:noVBand="1" w:val="04A0"/>
       </w:tblPr>
       <w:tblGrid>
-        <w:gridCol w:w="4968"/>
-        <w:gridCol w:w="4968"/>
+        <w:gridCol w:w="4824"/>
+        <w:gridCol w:w="4824"/>
       </w:tblGrid>
       <w:tr>
         <w:tc>
           <w:tcPr>
-            <w:tcW w:type="dxa" w:w="4968"/>
+            <w:tcW w:type="dxa" w:w="4824"/>
+            <w:shd w:fill="F8FAFC"/>
           </w:tcPr>
           <w:p>
+            <w:pPr>
+              <w:spacing w:after="40" w:before="40"/>
+            </w:pPr>
             <w:r>
               <w:rPr>
+                <w:rFonts w:ascii="Calibri" w:hAnsi="Calibri"/>
                 <w:b/>
-                <w:sz w:val="21"/>
+                <w:color w:val="0F172A"/>
+                <w:sz w:val="20"/>
               </w:rPr>
-              <w:t>Nombre del Estudiante:</w:t>
+              <w:t>Estudiante:</w:t>
             </w:r>
           </w:p>
         </w:tc>
         <w:tc>
           <w:tcPr>
-            <w:tcW w:type="dxa" w:w="4968"/>
+            <w:tcW w:type="dxa" w:w="4824"/>
           </w:tcPr>
           <w:p>
+            <w:pPr>
+              <w:spacing w:after="40" w:before="40"/>
+            </w:pPr>
             <w:r>
               <w:rPr>
-                <w:sz w:val="21"/>
+                <w:rFonts w:ascii="Calibri" w:hAnsi="Calibri"/>
+                <w:color w:val="0F172A"/>
+                <w:sz w:val="20"/>
               </w:rPr>
               <w:t>Samuel</w:t>
             </w:r>
@@ -93,28 +117,39 @@
       <w:tr>
         <w:tc>
           <w:tcPr>
-            <w:tcW w:type="dxa" w:w="4968"/>
+            <w:tcW w:type="dxa" w:w="4824"/>
+            <w:shd w:fill="F8FAFC"/>
           </w:tcPr>
           <w:p>
+            <w:pPr>
+              <w:spacing w:after="40" w:before="40"/>
+            </w:pPr>
             <w:r>
               <w:rPr>
+                <w:rFonts w:ascii="Calibri" w:hAnsi="Calibri"/>
                 <w:b/>
-                <w:sz w:val="21"/>
+                <w:color w:val="0F172A"/>
+                <w:sz w:val="20"/>
               </w:rPr>
-              <w:t>Asignatura:</w:t>
+              <w:t>Asignatura / Código:</w:t>
             </w:r>
           </w:p>
         </w:tc>
         <w:tc>
           <w:tcPr>
-            <w:tcW w:type="dxa" w:w="4968"/>
+            <w:tcW w:type="dxa" w:w="4824"/>
           </w:tcPr>
           <w:p>
+            <w:pPr>
+              <w:spacing w:after="40" w:before="40"/>
+            </w:pPr>
             <w:r>
               <w:rPr>
-                <w:sz w:val="21"/>
+                <w:rFonts w:ascii="Calibri" w:hAnsi="Calibri"/>
+                <w:color w:val="0F172A"/>
+                <w:sz w:val="20"/>
               </w:rPr>
-              <w:t>ETVI02 - Tendencias Emergentes en Inteligencia Artificial</w:t>
+              <w:t>Tendencias Emergentes en Inteligencia Artificial (ETVI02)</w:t>
             </w:r>
           </w:p>
         </w:tc>
@@ -122,26 +157,37 @@
       <w:tr>
         <w:tc>
           <w:tcPr>
-            <w:tcW w:type="dxa" w:w="4968"/>
+            <w:tcW w:type="dxa" w:w="4824"/>
+            <w:shd w:fill="F8FAFC"/>
           </w:tcPr>
           <w:p>
+            <w:pPr>
+              <w:spacing w:after="40" w:before="40"/>
+            </w:pPr>
             <w:r>
               <w:rPr>
+                <w:rFonts w:ascii="Calibri" w:hAnsi="Calibri"/>
                 <w:b/>
-                <w:sz w:val="21"/>
+                <w:color w:val="0F172A"/>
+                <w:sz w:val="20"/>
               </w:rPr>
-              <w:t>Institución:</w:t>
+              <w:t>Sede / Institución:</w:t>
             </w:r>
           </w:p>
         </w:tc>
         <w:tc>
           <w:tcPr>
-            <w:tcW w:type="dxa" w:w="4968"/>
+            <w:tcW w:type="dxa" w:w="4824"/>
           </w:tcPr>
           <w:p>
+            <w:pPr>
+              <w:spacing w:after="40" w:before="40"/>
+            </w:pPr>
             <w:r>
               <w:rPr>
-                <w:sz w:val="21"/>
+                <w:rFonts w:ascii="Calibri" w:hAnsi="Calibri"/>
+                <w:color w:val="0F172A"/>
+                <w:sz w:val="20"/>
               </w:rPr>
               <w:t>INACAP</w:t>
             </w:r>
@@ -151,26 +197,37 @@
       <w:tr>
         <w:tc>
           <w:tcPr>
-            <w:tcW w:type="dxa" w:w="4968"/>
+            <w:tcW w:type="dxa" w:w="4824"/>
+            <w:shd w:fill="F8FAFC"/>
           </w:tcPr>
           <w:p>
+            <w:pPr>
+              <w:spacing w:after="40" w:before="40"/>
+            </w:pPr>
             <w:r>
               <w:rPr>
+                <w:rFonts w:ascii="Calibri" w:hAnsi="Calibri"/>
                 <w:b/>
-                <w:sz w:val="21"/>
+                <w:color w:val="0F172A"/>
+                <w:sz w:val="20"/>
               </w:rPr>
-              <w:t>Fecha de Entrega:</w:t>
+              <w:t>Fecha de Evaluación:</w:t>
             </w:r>
           </w:p>
         </w:tc>
         <w:tc>
           <w:tcPr>
-            <w:tcW w:type="dxa" w:w="4968"/>
+            <w:tcW w:type="dxa" w:w="4824"/>
           </w:tcPr>
           <w:p>
+            <w:pPr>
+              <w:spacing w:after="40" w:before="40"/>
+            </w:pPr>
             <w:r>
               <w:rPr>
-                <w:sz w:val="21"/>
+                <w:rFonts w:ascii="Calibri" w:hAnsi="Calibri"/>
+                <w:color w:val="0F172A"/>
+                <w:sz w:val="20"/>
               </w:rPr>
               <w:t>11 de Octubre de 2026</w:t>
             </w:r>
@@ -178,76 +235,235 @@
         </w:tc>
       </w:tr>
     </w:tbl>
-    <w:p/>
+    <w:p>
+      <w:pPr>
+        <w:spacing w:after="240"/>
+      </w:pPr>
+    </w:p>
     <w:p>
       <w:pPr>
         <w:pStyle w:val="Heading1"/>
+        <w:spacing w:after="120"/>
       </w:pPr>
       <w:r>
         <w:rPr>
-          <w:color w:val="1E1E1E"/>
+          <w:rFonts w:ascii="Calibri" w:hAnsi="Calibri"/>
+          <w:b/>
+          <w:color w:val="0F172A"/>
+          <w:sz w:val="28"/>
         </w:rPr>
-        <w:t>2. Enlace al Repositorio en GitHub</w:t>
+        <w:t>1. Repositorio de Código Fuente</w:t>
+      </w:r>
+    </w:p>
+    <w:tbl>
+      <w:tblPr>
+        <w:tblStyle w:val="TableGrid"/>
+        <w:tblW w:type="auto" w:w="0"/>
+        <w:jc w:val="center"/>
+        <w:tblLook w:firstColumn="1" w:firstRow="1" w:lastColumn="0" w:lastRow="0" w:noHBand="0" w:noVBand="1" w:val="04A0"/>
+      </w:tblPr>
+      <w:tblGrid>
+        <w:gridCol w:w="9648"/>
+      </w:tblGrid>
+      <w:tr>
+        <w:tc>
+          <w:tcPr>
+            <w:tcW w:type="dxa" w:w="9648"/>
+            <w:shd w:fill="EFF6FF"/>
+          </w:tcPr>
+          <w:p>
+            <w:pPr>
+              <w:spacing w:before="120" w:after="120"/>
+            </w:pPr>
+            <w:r>
+              <w:rPr>
+                <w:rFonts w:ascii="Calibri" w:hAnsi="Calibri"/>
+                <w:b/>
+                <w:color w:val="0F172A"/>
+                <w:sz w:val="22"/>
+              </w:rPr>
+              <w:t xml:space="preserve">Repositorio Oficial en GitHub: </w:t>
+            </w:r>
+            <w:r>
+              <w:rPr>
+                <w:rFonts w:ascii="Calibri" w:hAnsi="Calibri"/>
+                <w:sz w:val="22"/>
+              </w:rPr>
+              <w:t>IA_Proyecto</w:t>
+              <w:br/>
+            </w:r>
+            <w:r>
+              <w:rPr>
+                <w:rFonts w:ascii="Calibri" w:hAnsi="Calibri"/>
+                <w:b/>
+                <w:color w:val="0F172A"/>
+                <w:sz w:val="22"/>
+              </w:rPr>
+              <w:t xml:space="preserve">Enlace Web de Acceso Público: </w:t>
+            </w:r>
+            <w:r>
+              <w:rPr>
+                <w:rFonts w:ascii="Calibri" w:hAnsi="Calibri"/>
+                <w:b/>
+                <w:color w:val="0284C7"/>
+                <w:sz w:val="22"/>
+              </w:rPr>
+              <w:t>https://github.com/rcktsm25/IA_Proyecto</w:t>
+              <w:br/>
+            </w:r>
+            <w:r>
+              <w:rPr>
+                <w:rFonts w:ascii="Calibri" w:hAnsi="Calibri"/>
+                <w:b/>
+                <w:color w:val="0F172A"/>
+                <w:sz w:val="21"/>
+              </w:rPr>
+              <w:t xml:space="preserve">Comando de Clonado Git: </w:t>
+            </w:r>
+            <w:r>
+              <w:rPr>
+                <w:rFonts w:ascii="Calibri" w:hAnsi="Calibri"/>
+                <w:color w:val="475569"/>
+                <w:sz w:val="21"/>
+              </w:rPr>
+              <w:t>git clone https://github.com/rcktsm25/IA_Proyecto.git (Rama: main)</w:t>
+            </w:r>
+          </w:p>
+        </w:tc>
+      </w:tr>
+    </w:tbl>
+    <w:p>
+      <w:pPr>
+        <w:spacing w:after="200"/>
+      </w:pPr>
+    </w:p>
+    <w:p>
+      <w:pPr>
+        <w:pStyle w:val="Heading1"/>
+        <w:spacing w:after="120"/>
+      </w:pPr>
+      <w:r>
+        <w:rPr>
+          <w:rFonts w:ascii="Calibri" w:hAnsi="Calibri"/>
+          <w:b/>
+          <w:color w:val="0F172A"/>
+          <w:sz w:val="28"/>
+        </w:rPr>
+        <w:t>2. Resumen Ejecutivo del Proyecto</w:t>
       </w:r>
     </w:p>
     <w:p>
+      <w:pPr>
+        <w:spacing w:line="276" w:lineRule="auto" w:after="280"/>
+      </w:pPr>
       <w:r>
-        <w:t xml:space="preserve">• Nombre del Repositorio: </w:t>
+        <w:rPr>
+          <w:rFonts w:ascii="Calibri" w:hAnsi="Calibri"/>
+          <w:sz w:val="22"/>
+        </w:rPr>
+        <w:t xml:space="preserve">El presente proyecto da cumplimiento a los requerimientos de la actividad formativa ETVI02_U3_S8_AF de INACAP, cuyo objetivo es explorar de manera práctica las capacidades de </w:t>
       </w:r>
       <w:r>
         <w:rPr>
+          <w:rFonts w:ascii="Calibri" w:hAnsi="Calibri"/>
           <w:b/>
+          <w:sz w:val="22"/>
         </w:rPr>
-        <w:t>IA_Proyecto</w:t>
+        <w:t>GitHub Copilot</w:t>
+      </w:r>
+      <w:r>
+        <w:rPr>
+          <w:rFonts w:ascii="Calibri" w:hAnsi="Calibri"/>
+          <w:sz w:val="22"/>
+        </w:rPr>
+        <w:t xml:space="preserve"> como asistente inteligente para la ingeniería de software y el aprendizaje automático. Se desarrolló un sistema completo de clasificación y recomendación de productos basado en el algoritmo supervisado </w:t>
+      </w:r>
+      <w:r>
+        <w:rPr>
+          <w:rFonts w:ascii="Calibri" w:hAnsi="Calibri"/>
+          <w:b/>
+          <w:sz w:val="22"/>
+        </w:rPr>
+        <w:t>K-Nearest Neighbors (KNN)</w:t>
+      </w:r>
+      <w:r>
+        <w:rPr>
+          <w:rFonts w:ascii="Calibri" w:hAnsi="Calibri"/>
+          <w:sz w:val="22"/>
+        </w:rPr>
+        <w:t>, utilizando Python y bibliotecas especializadas de ciencia de datos (Pandas, NumPy y Scikit-Learn).</w:t>
+        <w:br/>
+        <w:br/>
+        <w:t>El flujo de trabajo abarcó desde la inicialización y versionamiento del repositorio con Git, la estructuración del dataset de entrenamiento ('products.csv'), la generación asistida del código predictivo y de preprocesamiento, hasta la validación empírica con una precisión del 100% y la creación de un panel visual analítico.</w:t>
       </w:r>
     </w:p>
     <w:p>
-      <w:r>
-        <w:t xml:space="preserve">• Enlace URL: </w:t>
-      </w:r>
-      <w:r>
-        <w:rPr>
-          <w:b/>
-          <w:color w:val="0050BE"/>
-          <w:sz w:val="24"/>
-        </w:rPr>
-        <w:t>https://github.com/rcktsm25/IA_Proyecto</w:t>
-      </w:r>
-    </w:p>
-    <w:p/>
-    <w:p>
       <w:pPr>
         <w:pStyle w:val="Heading1"/>
+        <w:spacing w:after="160"/>
       </w:pPr>
       <w:r>
         <w:rPr>
-          <w:color w:val="1E1E1E"/>
+          <w:rFonts w:ascii="Calibri" w:hAnsi="Calibri"/>
+          <w:b/>
+          <w:color w:val="0F172A"/>
+          <w:sz w:val="28"/>
         </w:rPr>
-        <w:t>3. Ítems de Comprobación y Evidencias</w:t>
+        <w:t>3. Ítems de Comprobación y Evidencias de Desarrollo</w:t>
       </w:r>
     </w:p>
     <w:p>
       <w:pPr>
         <w:pStyle w:val="Heading2"/>
+        <w:spacing w:after="60"/>
       </w:pPr>
       <w:r>
         <w:rPr>
-          <w:color w:val="141414"/>
-          <w:sz w:val="26"/>
+          <w:rFonts w:ascii="Calibri" w:hAnsi="Calibri"/>
+          <w:b/>
+          <w:color w:val="0F172A"/>
+          <w:sz w:val="25"/>
         </w:rPr>
         <w:t>1. 01_github_setup.png:</w:t>
       </w:r>
     </w:p>
     <w:p>
+      <w:pPr>
+        <w:spacing w:after="80"/>
+      </w:pPr>
       <w:r>
         <w:rPr>
+          <w:rFonts w:ascii="Calibri" w:hAnsi="Calibri"/>
           <w:i/>
+          <w:color w:val="475569"/>
           <w:sz w:val="21"/>
         </w:rPr>
         <w:t>Captura de pantalla de la página de GitHub mostrando tu repositorio 'IA_Proyecto'.</w:t>
       </w:r>
     </w:p>
     <w:p>
+      <w:pPr>
+        <w:spacing w:after="160"/>
+      </w:pPr>
+      <w:r>
+        <w:rPr>
+          <w:b/>
+          <w:sz w:val="20"/>
+        </w:rPr>
+        <w:t xml:space="preserve">• Propósito pedagógico: </w:t>
+      </w:r>
+      <w:r>
+        <w:rPr>
+          <w:sz w:val="20"/>
+        </w:rPr>
+        <w:t>Acredita la correcta creación del repositorio remoto en GitHub ('rcktsm25/IA_Proyecto'), la rama activa 'main', el historial sincronizado de commits y la estructura de archivos requerida (.gitignore, README.md, products.csv, recommendation_system.py, carpeta screenshots y documentos de entrega).</w:t>
+      </w:r>
+    </w:p>
+    <w:p>
+      <w:pPr>
+        <w:spacing w:after="40"/>
+        <w:jc w:val="center"/>
+      </w:pPr>
       <w:r>
         <w:drawing>
           <wp:inline xmlns:a="http://schemas.openxmlformats.org/drawingml/2006/main" xmlns:pic="http://schemas.openxmlformats.org/drawingml/2006/picture">
@@ -283,29 +499,72 @@
         </w:drawing>
       </w:r>
     </w:p>
-    <w:p/>
+    <w:p>
+      <w:pPr>
+        <w:spacing w:after="320"/>
+        <w:jc w:val="center"/>
+      </w:pPr>
+      <w:r>
+        <w:rPr>
+          <w:i/>
+          <w:color w:val="475569"/>
+          <w:sz w:val="18"/>
+        </w:rPr>
+        <w:t>Figura 1. Vista del repositorio público 'IA_Proyecto' en la plataforma GitHub.</w:t>
+      </w:r>
+    </w:p>
     <w:p>
       <w:pPr>
         <w:pStyle w:val="Heading2"/>
+        <w:spacing w:after="60"/>
       </w:pPr>
       <w:r>
         <w:rPr>
-          <w:color w:val="141414"/>
-          <w:sz w:val="26"/>
+          <w:rFonts w:ascii="Calibri" w:hAnsi="Calibri"/>
+          <w:b/>
+          <w:color w:val="0F172A"/>
+          <w:sz w:val="25"/>
         </w:rPr>
         <w:t>2. 02_copilot_suggestion.png:</w:t>
       </w:r>
     </w:p>
     <w:p>
+      <w:pPr>
+        <w:spacing w:after="80"/>
+      </w:pPr>
       <w:r>
         <w:rPr>
+          <w:rFonts w:ascii="Calibri" w:hAnsi="Calibri"/>
           <w:i/>
+          <w:color w:val="475569"/>
           <w:sz w:val="21"/>
         </w:rPr>
         <w:t>Captura de pantalla en Visual Studio Code mostrando cómo GitHub Copilot te sugiere código (autocompletado gris o el panel/chat de Copilot).</w:t>
       </w:r>
     </w:p>
     <w:p>
+      <w:pPr>
+        <w:spacing w:after="160"/>
+      </w:pPr>
+      <w:r>
+        <w:rPr>
+          <w:b/>
+          <w:sz w:val="20"/>
+        </w:rPr>
+        <w:t xml:space="preserve">• Propósito pedagógico: </w:t>
+      </w:r>
+      <w:r>
+        <w:rPr>
+          <w:sz w:val="20"/>
+        </w:rPr>
+        <w:t>Evidencia el funcionamiento activo de la extensión oficial de GitHub Copilot en Visual Studio Code, proporcionando sugerencias multilínea en tiempo real (texto en gris atenuado) para optimizar la lógica condicional y el manejo del modelo predictivo dentro de 'recommendation_system.py'.</w:t>
+      </w:r>
+    </w:p>
+    <w:p>
+      <w:pPr>
+        <w:spacing w:after="40"/>
+        <w:jc w:val="center"/>
+      </w:pPr>
       <w:r>
         <w:drawing>
           <wp:inline xmlns:a="http://schemas.openxmlformats.org/drawingml/2006/main" xmlns:pic="http://schemas.openxmlformats.org/drawingml/2006/picture">
@@ -341,29 +600,72 @@
         </w:drawing>
       </w:r>
     </w:p>
-    <w:p/>
+    <w:p>
+      <w:pPr>
+        <w:spacing w:after="320"/>
+        <w:jc w:val="center"/>
+      </w:pPr>
+      <w:r>
+        <w:rPr>
+          <w:i/>
+          <w:color w:val="475569"/>
+          <w:sz w:val="18"/>
+        </w:rPr>
+        <w:t>Figura 2. Asistencia en tiempo real de GitHub Copilot sugiriendo autocompletado en VS Code.</w:t>
+      </w:r>
+    </w:p>
     <w:p>
       <w:pPr>
         <w:pStyle w:val="Heading2"/>
+        <w:spacing w:after="60"/>
       </w:pPr>
       <w:r>
         <w:rPr>
-          <w:color w:val="141414"/>
-          <w:sz w:val="26"/>
+          <w:rFonts w:ascii="Calibri" w:hAnsi="Calibri"/>
+          <w:b/>
+          <w:color w:val="0F172A"/>
+          <w:sz w:val="25"/>
         </w:rPr>
         <w:t>3. 03_execution_result.png:</w:t>
       </w:r>
     </w:p>
     <w:p>
+      <w:pPr>
+        <w:spacing w:after="80"/>
+      </w:pPr>
       <w:r>
         <w:rPr>
+          <w:rFonts w:ascii="Calibri" w:hAnsi="Calibri"/>
           <w:i/>
+          <w:color w:val="475569"/>
           <w:sz w:val="21"/>
         </w:rPr>
         <w:t>Captura de pantalla de la terminal en VS Code ejecutando 'python recommendation_system.py'.</w:t>
       </w:r>
     </w:p>
     <w:p>
+      <w:pPr>
+        <w:spacing w:after="160"/>
+      </w:pPr>
+      <w:r>
+        <w:rPr>
+          <w:b/>
+          <w:sz w:val="20"/>
+        </w:rPr>
+        <w:t xml:space="preserve">• Propósito pedagógico: </w:t>
+      </w:r>
+      <w:r>
+        <w:rPr>
+          <w:sz w:val="20"/>
+        </w:rPr>
+        <w:t>Demuestra la correcta ejecución del entorno virtual nativo (.venv) en macOS, la carga de los 25 productos, el entrenamiento del modelo con métrica perfecta de exactitud (Accuracy 100.0%) y la visualización de la tabla de recomendaciones en consola clasificando correctamente productos en Smartphones, Laptops, Accesorios, Smartwatches y Audio.</w:t>
+      </w:r>
+    </w:p>
+    <w:p>
+      <w:pPr>
+        <w:spacing w:after="40"/>
+        <w:jc w:val="center"/>
+      </w:pPr>
       <w:r>
         <w:drawing>
           <wp:inline xmlns:a="http://schemas.openxmlformats.org/drawingml/2006/main" xmlns:pic="http://schemas.openxmlformats.org/drawingml/2006/picture">
@@ -399,10 +701,140 @@
         </w:drawing>
       </w:r>
     </w:p>
-    <w:p/>
+    <w:p>
+      <w:pPr>
+        <w:spacing w:after="320"/>
+        <w:jc w:val="center"/>
+      </w:pPr>
+      <w:r>
+        <w:rPr>
+          <w:i/>
+          <w:color w:val="475569"/>
+          <w:sz w:val="18"/>
+        </w:rPr>
+        <w:t>Figura 3. Salida de ejecución en la terminal integrada de VS Code con resultados de inferencia.</w:t>
+      </w:r>
+    </w:p>
+    <w:p>
+      <w:pPr>
+        <w:pStyle w:val="Heading2"/>
+        <w:spacing w:after="60"/>
+      </w:pPr>
+      <w:r>
+        <w:rPr>
+          <w:rFonts w:ascii="Calibri" w:hAnsi="Calibri"/>
+          <w:b/>
+          <w:color w:val="0F172A"/>
+          <w:sz w:val="25"/>
+        </w:rPr>
+        <w:t>4. Evidencia Complementaria: Dashboard Gráfico del Modelo</w:t>
+      </w:r>
+    </w:p>
+    <w:p>
+      <w:pPr>
+        <w:spacing w:after="160"/>
+      </w:pPr>
+      <w:r>
+        <w:rPr>
+          <w:b/>
+          <w:sz w:val="20"/>
+        </w:rPr>
+        <w:t xml:space="preserve">• Descripción técnica: </w:t>
+      </w:r>
+      <w:r>
+        <w:rPr>
+          <w:sz w:val="20"/>
+        </w:rPr>
+        <w:t>Panel gráfico analítico generado mediante Matplotlib y Seaborn, mostrando la dispersión de categorías en el espacio de características (Precio vs Popularidad), los puntos proyectados de inferencia y la matriz de confusión multiclase validada.</w:t>
+      </w:r>
+    </w:p>
+    <w:p>
+      <w:pPr>
+        <w:spacing w:after="40"/>
+        <w:jc w:val="center"/>
+      </w:pPr>
+      <w:r>
+        <w:drawing>
+          <wp:inline xmlns:a="http://schemas.openxmlformats.org/drawingml/2006/main" xmlns:pic="http://schemas.openxmlformats.org/drawingml/2006/picture">
+            <wp:extent cx="5669280" cy="2256297"/>
+            <wp:docPr id="4" name="Picture 4"/>
+            <wp:cNvGraphicFramePr>
+              <a:graphicFrameLocks noChangeAspect="1"/>
+            </wp:cNvGraphicFramePr>
+            <a:graphic>
+              <a:graphicData uri="http://schemas.openxmlformats.org/drawingml/2006/picture">
+                <pic:pic>
+                  <pic:nvPicPr>
+                    <pic:cNvPr id="0" name="03_model_clusters.png"/>
+                    <pic:cNvPicPr/>
+                  </pic:nvPicPr>
+                  <pic:blipFill>
+                    <a:blip r:embed="rId12"/>
+                    <a:stretch>
+                      <a:fillRect/>
+                    </a:stretch>
+                  </pic:blipFill>
+                  <pic:spPr>
+                    <a:xfrm>
+                      <a:off x="0" y="0"/>
+                      <a:ext cx="5669280" cy="2256297"/>
+                    </a:xfrm>
+                    <a:prstGeom prst="rect"/>
+                  </pic:spPr>
+                </pic:pic>
+              </a:graphicData>
+            </a:graphic>
+          </wp:inline>
+        </w:drawing>
+      </w:r>
+    </w:p>
+    <w:p>
+      <w:pPr>
+        <w:spacing w:after="320"/>
+        <w:jc w:val="center"/>
+      </w:pPr>
+      <w:r>
+        <w:rPr>
+          <w:i/>
+          <w:color w:val="475569"/>
+          <w:sz w:val="18"/>
+        </w:rPr>
+        <w:t>Figura 4. Dashboard de análisis del modelo KNN y evaluación de matriz de confusión.</w:t>
+      </w:r>
+    </w:p>
+    <w:p>
+      <w:pPr>
+        <w:pStyle w:val="Heading1"/>
+        <w:spacing w:after="120"/>
+      </w:pPr>
+      <w:r>
+        <w:rPr>
+          <w:rFonts w:ascii="Calibri" w:hAnsi="Calibri"/>
+          <w:b/>
+          <w:color w:val="0F172A"/>
+          <w:sz w:val="28"/>
+        </w:rPr>
+        <w:t>4. Conclusión Técnica y Aprendizajes</w:t>
+      </w:r>
+    </w:p>
+    <w:p>
+      <w:pPr>
+        <w:spacing w:line="276" w:lineRule="auto" w:after="200"/>
+      </w:pPr>
+      <w:r>
+        <w:rPr>
+          <w:rFonts w:ascii="Calibri" w:hAnsi="Calibri"/>
+          <w:sz w:val="22"/>
+        </w:rPr>
+        <w:t>La integración de GitHub Copilot en el ciclo de desarrollo de soluciones basadas en Inteligencia Artificial demuestra ser un multiplicador de productividad significativo. Permite reducir el tiempo dedicado a la sintaxis repetitiva de librerías como Scikit-Learn y Pandas, a la vez que sugiere estructuras de código consistentes.</w:t>
+        <w:br/>
+        <w:br/>
+        <w:t>No obstante, se evidencia que el criterio del desarrollador sigue siendo fundamental para la preparación del dataset, la parametrización de hiperparámetros (como la elección de k en KNN) y la interpretación de métricas de desempeño, consolidando a Copilot como un copiloto de programación y no un sustituto de la ingeniería.</w:t>
+      </w:r>
+    </w:p>
     <w:sectPr>
       <w:pgSz w:w="12240" w:h="15840"/>
-      <w:pgMar w:top="1152" w:right="1152" w:bottom="1152" w:left="1152" w:header="720" w:footer="720" w:gutter="0"/>
+      <w:pgMar w:top="1296" w:right="1296" w:bottom="1296" w:left="1296" w:header="720" w:footer="720" w:gutter="0"/>
       <w:cols w:space="720"/>
       <w:docGrid w:linePitch="360"/>
     </w:sectPr>

</xml_diff>